<commit_message>
feat(omni-ecosystems): integrate Windmill workflow engine, Blackbird OSINT suite, Bangalore referral strike, and war chest assets
</commit_message>
<xml_diff>
--- a/applications_generated/akuna_capital_university_software_engineer_intern_python/ATS_RESUME.docx
+++ b/applications_generated/akuna_capital_university_software_engineer_intern_python/ATS_RESUME.docx
@@ -594,31 +594,31 @@
       </w:rPr>
     </w:lvl>
   </w:abstractNum>
-  <w:num w:numId="1" w16cid:durableId="2130778826">
+  <w:num w:numId="1" w16cid:durableId="1712223070">
     <w:abstractNumId w:val="8"/>
   </w:num>
-  <w:num w:numId="2" w16cid:durableId="2143882410">
+  <w:num w:numId="2" w16cid:durableId="2099859087">
     <w:abstractNumId w:val="6"/>
   </w:num>
-  <w:num w:numId="3" w16cid:durableId="609901489">
+  <w:num w:numId="3" w16cid:durableId="750085975">
     <w:abstractNumId w:val="5"/>
   </w:num>
-  <w:num w:numId="4" w16cid:durableId="169149421">
+  <w:num w:numId="4" w16cid:durableId="224068839">
     <w:abstractNumId w:val="4"/>
   </w:num>
-  <w:num w:numId="5" w16cid:durableId="765030309">
+  <w:num w:numId="5" w16cid:durableId="1793010100">
     <w:abstractNumId w:val="7"/>
   </w:num>
-  <w:num w:numId="6" w16cid:durableId="2025666050">
+  <w:num w:numId="6" w16cid:durableId="961619792">
     <w:abstractNumId w:val="3"/>
   </w:num>
-  <w:num w:numId="7" w16cid:durableId="126319050">
+  <w:num w:numId="7" w16cid:durableId="718013660">
     <w:abstractNumId w:val="2"/>
   </w:num>
-  <w:num w:numId="8" w16cid:durableId="770659024">
+  <w:num w:numId="8" w16cid:durableId="1147472248">
     <w:abstractNumId w:val="1"/>
   </w:num>
-  <w:num w:numId="9" w16cid:durableId="1164583997">
+  <w:num w:numId="9" w16cid:durableId="733821197">
     <w:abstractNumId w:val="0"/>
   </w:num>
 </w:numbering>

</xml_diff>

<commit_message>
feat(omni-ecosystems-final): integrate Airflow, Arrow, Plane, Infisical, Ghidra, and Free-for-Dev platforms
</commit_message>
<xml_diff>
--- a/applications_generated/akuna_capital_university_software_engineer_intern_python/ATS_RESUME.docx
+++ b/applications_generated/akuna_capital_university_software_engineer_intern_python/ATS_RESUME.docx
@@ -594,31 +594,31 @@
       </w:rPr>
     </w:lvl>
   </w:abstractNum>
-  <w:num w:numId="1" w16cid:durableId="1712223070">
+  <w:num w:numId="1" w16cid:durableId="209848152">
     <w:abstractNumId w:val="8"/>
   </w:num>
-  <w:num w:numId="2" w16cid:durableId="2099859087">
+  <w:num w:numId="2" w16cid:durableId="1986157019">
     <w:abstractNumId w:val="6"/>
   </w:num>
-  <w:num w:numId="3" w16cid:durableId="750085975">
+  <w:num w:numId="3" w16cid:durableId="747767235">
     <w:abstractNumId w:val="5"/>
   </w:num>
-  <w:num w:numId="4" w16cid:durableId="224068839">
+  <w:num w:numId="4" w16cid:durableId="945190960">
     <w:abstractNumId w:val="4"/>
   </w:num>
-  <w:num w:numId="5" w16cid:durableId="1793010100">
+  <w:num w:numId="5" w16cid:durableId="1047946770">
     <w:abstractNumId w:val="7"/>
   </w:num>
-  <w:num w:numId="6" w16cid:durableId="961619792">
+  <w:num w:numId="6" w16cid:durableId="1574310649">
     <w:abstractNumId w:val="3"/>
   </w:num>
-  <w:num w:numId="7" w16cid:durableId="718013660">
+  <w:num w:numId="7" w16cid:durableId="464858706">
     <w:abstractNumId w:val="2"/>
   </w:num>
-  <w:num w:numId="8" w16cid:durableId="1147472248">
+  <w:num w:numId="8" w16cid:durableId="1032193841">
     <w:abstractNumId w:val="1"/>
   </w:num>
-  <w:num w:numId="9" w16cid:durableId="733821197">
+  <w:num w:numId="9" w16cid:durableId="795608012">
     <w:abstractNumId w:val="0"/>
   </w:num>
 </w:numbering>

</xml_diff>